<commit_message>
Philippians audit: 8 gates pass, 13 text fixes + 1 metadata fix, docs reuploaded
</commit_message>
<xml_diff>
--- a/gdocs_build/Philippians.docx
+++ b/gdocs_build/Philippians.docx
@@ -329,7 +329,7 @@
               <w:rPr>
                 <w:sz w:val="18"/>
               </w:rPr>
-              <w:t>And for real, I'm not just gassing you up. You guys are my ride-or-dies. You stuck with me when I was in jail, when I was on trial, and when I got out. You've been there for the whole crazy ride, and God's been super generous to us through it all. He knows I miss you guys like crazy. Sometimes I feel like I'm on the same wavelength as Jesus about you.</w:t>
+              <w:t>And for real, I'm not just gassing you up. You guys are my ride-or-dies. You stuck with me when I was in jail, when I was on trial, and when I got out. You've been there for the whole crazy ride, and God's been super generous to us through it all. He knows I love and miss you guys like crazy. Sometimes I feel like I'm on the same wavelength as Jesus about you.</w:t>
             </w:r>
           </w:p>
         </w:tc>
@@ -557,7 +557,7 @@
               <w:rPr>
                 <w:sz w:val="18"/>
               </w:rPr>
-              <w:t>친구들아, 꼭 알려주고 싶은 게 있어. 내가 여기 갇힌 게 오히려 반대 결과를 낳았어. 메시지가 눌리기는컨녕 오히려 더 흥했거든. 여기 모든 군인들이랑 다른 사람들까지, 내가 메시아 때문에 감옥에 있다는 걸 다 알게 됐어. 그게 사람들 호기심을 자극해서 이제는 예수님에 대해 다 알게 됐지. 게다가 여기 있는 예수님 따르는 사람들 대부분이 전보다 훨씬 믿음에 확신이 생겨서, 하나님과 메시아에 대해 쫄지 않고 당당하게 말하고 있어.</w:t>
+              <w:t>친구들아, 꼭 알려주고 싶은 게 있어. 내가 여기 갇힌 게 걔들이 원했던 거랑은 정반대로 됐어. 메시지가 눌리기는커녕 오히려 더 흥했거든. 여기 모든 군인들이랑 다른 사람들까지, 내가 메시아 때문에 감옥에 있다는 걸 다 알게 됐어. 그게 사람들 호기심을 자극해서 이제는 예수님에 대해 다 알게 됐지. 게다가 여기 있는 예수님 따르는 사람들 대부분이 전보다 훨씬 믿음에 확신이 생겨서, 하나님과 메시아에 대해 쫄지 않고 당당하게 말하고 있어.</w:t>
             </w:r>
           </w:p>
         </w:tc>
@@ -707,7 +707,7 @@
               <w:rPr>
                 <w:sz w:val="18"/>
               </w:rPr>
-              <w:t>그럼 나는 어떻게 반응해야 할까? 걀들 동기가 섞였든, 나쁘든, 애매하든 신경 안 쓰기로 했어. 걀들 중 누구라도 입만 열면 그리스도가 전파되니까, 그냥 응원할 뿐이야!</w:t>
+              <w:t>그럼 나는 어떻게 반응해야 할까? 걔들 동기가 섞였든, 나쁘든, 애매하든 신경 안 쓰기로 했어. 걔들 중 누구라도 입만 열면 그리스도가 전파되니까, 그냥 응원할 뿐이야!</w:t>
             </w:r>
           </w:p>
         </w:tc>
@@ -755,7 +755,7 @@
               <w:rPr>
                 <w:sz w:val="18"/>
               </w:rPr>
-              <w:t>And I'm gonna keep on cheering, because I know how this is all gonna end. With your prayers and the help of Jesus's Spirit, everything he wants to do in me and through me is gonna get done. I can't wait to see what's next. I'm not worried about being embarrassed at all. In fact, everything that's happening to me in here is just making Jesus more famous, whether I live or die. They didn't shut me up; they gave me a bigger stage! If I'm alive, I'm Jesus's messenger; if I'm dead, I'm his prize. It's a win-win. I can't lose.</w:t>
+              <w:t>And I'm gonna keep on cheering, because I know how this is all gonna end. With your faithful prayers and the generous help of Jesus's Spirit, everything he wants to do in me and through me is gonna get done. I can't wait to see what's next. I'm not worried about being embarrassed at all. In fact, everything that's happening to me in here is just making Jesus more famous, whether I live or die. They didn't shut me up; they gave me a bigger stage! If I'm alive, I'm Jesus's messenger; if I'm dead, I'm his prize. It's a win-win. I can't lose.</w:t>
             </w:r>
           </w:p>
         </w:tc>
@@ -778,7 +778,7 @@
               <w:rPr>
                 <w:sz w:val="18"/>
               </w:rPr>
-              <w:t>그리고 이 응원은 계속될 거야. 일이 어떻게 될지 아니까. 너희의 신실한 기도와 예수 그리스도의 영이 아낌없이 도우시는 덕분에, 그분이 내 안에서, 나를 통해 하시려는 모든 일이 이루어질 거든. 계속 내 길을 가는 게 너무 기대돼. 부끄러울 것 하나도 없어. 오히려 감옥에 있는 나한테 일어나는 모든 일이, 살든지 죽든지, 그리스도를 더 정확하게 알리는 데 쓰이고 있으니까. 걀들은 내 입을 막기는컨녕 오히려 나한테 무대를 만들어준 셈이지! 살아 있으면 나는 그리스도의 메신저, 죽으면 그분의 트로피. 지금 삶도, 훨씬 더 좋은 다음 삶도, 어느 쪽이든 나는 완전 이득!</w:t>
+              <w:t>그리고 이 응원은 계속될 거야. 일이 어떻게 될지 아니까. 너희의 신실한 기도와 예수 그리스도의 영이 아낌없이 도우시는 덕분에, 그분이 내 안에서, 나를 통해 하시려는 모든 일이 이루어질 거든. 계속 내 길을 가는 게 너무 기대돼. 부끄러울 것 하나도 없어. 오히려 감옥에 있는 나한테 일어나는 모든 일이, 살든지 죽든지, 그리스도를 더 정확하게 알리는 데 쓰이고 있으니까. 걔들은 내 입을 막기는커녕 오히려 나한테 무대를 만들어준 셈이지! 살아 있으면 나는 그리스도의 메신저, 죽으면 그분의 트로피. 지금 삶도, 훨씬 더 좋은 다음 삶도, 어느 쪽이든 나는 완전 이득!</w:t>
             </w:r>
           </w:p>
         </w:tc>
@@ -826,7 +826,7 @@
               <w:rPr>
                 <w:sz w:val="18"/>
               </w:rPr>
-              <w:t>As long as I'm alive, I've got good work to do. If I had to choose right now, I don't know what I'd pick. It's a tough call! The thought of leaving this life and being with Jesus is awesome. Some days, that's all I want. But most days, because of what you guys are going through, I know it's better for me to stick around. So, I'm planning on being here for a while, to help you grow and be joyful in your faith. You can look forward to a big reunion when I come visit you again. We'll be praising Jesus and having a great time together.</w:t>
+              <w:t>As long as I'm alive in this body, I've got good work to do. If I had to choose right now, I don't know what I'd pick. It's a tough call! The thought of leaving this life and being with Jesus is awesome. Some days, that's all I want. But most days, because of what you guys are going through, I know it's better for me to stick around. So, I'm planning on being here for a while, to help you grow and be joyful in your faith. You can look forward to a big reunion when I come visit you again. We'll be praising Jesus and having a great time together.</w:t>
             </w:r>
           </w:p>
         </w:tc>
@@ -920,7 +920,7 @@
               <w:rPr>
                 <w:sz w:val="18"/>
               </w:rPr>
-              <w:t>그때까지 그리스도의 메시지에 어울리는, 명예로운 삶을 살아. 너희 행동이 내가 오느냐 안 오느냐에 따라 달라지면 안 돼. 내가 직접 와서 보든, 멀리서 소식만 듣든, 너희 행동은 한결같아야 해. 하나가 되어, 한 비전으로 굳게 서서, 사람들이 메시지, 곧 복된 소식을 믿도록 힘써 싸워. 적들 앞에서 쫄지나 피하지 마. 너희의 용기와 하나 됨이 걀들한테 보여줄 거야. 걀들한테는 패배, 너희한테는 승리라는 걸. 둘 다 하나님에게서 오는 거야. 이 삶에는 그리스도를 믿는 것 말고도 더 있어. 그분을 위해 고난받는 것도 있지. 고난은 믿음만큼이나 값진 선물이야. 너희는 내가 어떤 싸움을 싸워왔는지 봤고, 지금 이 편지를 통해 업데이트된 소식을 듣고 있는 거야. 너희도 똑같은 싸움에 함께하고 있어.</w:t>
+              <w:t>그때까지 그리스도의 메시지에 어울리는, 명예로운 삶을 살아. 너희 행동이 내가 오느냐 안 오느냐에 따라 달라지면 안 돼. 내가 직접 와서 보든, 멀리서 소식만 듣든, 너희 행동은 한결같아야 해. 하나가 되어, 한 비전으로 굳게 서서, 사람들이 메시지, 곧 복된 소식을 믿도록 힘써 싸워. 적들 앞에서 쫄지나 피하지 마. 너희의 용기와 하나 됨이 걔들한테 보여줄 거야. 걔들한테는 패배, 너희한테는 승리라는 걸. 둘 다 하나님에게서 오는 거야. 이 삶에는 그리스도를 믿는 것 말고도 더 있어. 그분을 위해 고난받는 것도 있지. 고난은 믿음만큼이나 값진 선물이야. 너희는 내가 어떤 싸움을 싸워왔는지 봤고, 지금 이 편지를 통해 업데이트된 소식을 듣고 있는 거야. 너희도 똑같은 싸움에 함께하고 있어.</w:t>
             </w:r>
           </w:p>
         </w:tc>
@@ -1374,7 +1374,7 @@
               <w:rPr>
                 <w:sz w:val="18"/>
               </w:rPr>
-              <w:t>So, my friends, here's the deal. Just keep doing what you've been doing. When I was with you, you were all about listening and obeying. Now that I'm gone, you gotta step it up even more. Go hard in your faith, and be respectful and aware of God. That power you feel? That's God's own energy deep inside you — God Himself willing it and working it, going after what makes Him happiest.</w:t>
+              <w:t>So, my friends, here's the deal. Just keep doing what you've been doing from the beginning. When I was with you, you were all about listening and obeying. Now that I'm gone, you gotta step it up even more. Go hard in your faith, and be respectful and aware of God. That power you feel? That's God's own energy deep inside you — God Himself willing it and working it, going after what makes Him happiest.</w:t>
             </w:r>
           </w:p>
         </w:tc>
@@ -2009,7 +2009,7 @@
               <w:rPr>
                 <w:sz w:val="18"/>
               </w:rPr>
-              <w:t>Steer clear of the barking dogs — those religious busybodies who are all bark and no bite. They're obsessed with appearances — knife-happy circumcisers, I call them. The real believers are the ones led by God's Spirit, working hard at this ministry and filling the air with Christ's praise. We know we could never pull this off on our own — even though some people flash what look like impressive credentials. You know my pedigree: born legit, circumcised on the eighth day, an Israelite from the elite tribe of Benjamin, a strict and hardcore follower of God's law, so fired up about keeping my religion pure that I even went after the church, and a meticulous keeper of everything written in God's law book.</w:t>
+              <w:t>Steer clear of the barking dogs — those religious busybodies who are all bark and no bite. They're obsessed with appearances — knife-happy circumcisers, I call them. The real believers are the ones led by God's Spirit, working hard at this ministry and filling the air with Christ's praise, like we always do. We know we could never pull this off on our own — even though we've got what most people would call impressive credentials. You know my pedigree: born legit, circumcised on the eighth day, an Israelite from the elite tribe of Benjamin, a strict and hardcore follower of God's law, so fired up about keeping my religion pure that I even went after the church, and a meticulous keeper of everything written in God's law book.</w:t>
             </w:r>
           </w:p>
         </w:tc>
@@ -2032,7 +2032,7 @@
               <w:rPr>
                 <w:sz w:val="18"/>
               </w:rPr>
-              <w:t>왈왈 짖어대는 개들, 그러니까 맨날 참견하는 종교인들, 시끄럽기만 하고 알맹이는 없는 그런 사람들은 피해 다녀. 걔네는 겉모습에만 목숨 거는 애들이야. 나는 걔네를 '할례 수술 매니아'라고 부른다. 진짜 믿는 사람은 하나님의 영이 이끄시는 대로 이 사역을 열심히 하고, 우리가 늘 하듯이 그리스도 찬양으로 세상을 가득 채우는 사람들이야. 우리 힘만으로는 절대 못 할 일이라는 거 우리 다 알잖아. 사람들이 아무리 대단해 보이는 스펙을 들이밀어도 말이야. 너희 내 배경 알지? 합법적으로 태어나서 여드레 만에 할례 받았고, 명문 베냐민 지파 출신 이스라엘 사람. 하나님의 율법을 엄격하고 열심히 지켰고, 우리 종교의 순수성을 지키겠다고 교회를 박해하기까지 했어. 하나님의 율법책에 적힌 건 하나도 빠짐없이 다 지켰다고.</w:t>
+              <w:t>왈왈 짖어대는 개들, 그러니까 맨날 참견하는 종교인들, 시끄럽기만 하고 알맹이는 없는 그런 사람들은 피해 다녀. 걔네는 겉모습에만 목숨 거는 애들이야. 나는 걔네를 '할례 수술 매니아'라고 부른다. 진짜 믿는 사람은 하나님의 영이 이끄시는 대로 이 사역을 열심히 하고, 우리가 늘 하듯이 그리스도 찬양으로 세상을 가득 채우는 사람들이야. 우리 힘만으로는 절대 못 할 일이라는 거 우리 다 알잖아. 우리가 내세울 만한 스펙이 많아도 말이야. 너희 내 배경 알지? 합법적으로 태어나서 여드레 만에 할례 받았고, 명문 베냐민 지파 출신 이스라엘 사람. 하나님의 율법을 엄격하고 열심히 지켰고, 우리 종교의 순수성을 지키겠다고 교회를 박해하기까지 했어. 하나님의 율법책에 적힌 건 하나도 빠짐없이 다 지켰다고.</w:t>
             </w:r>
           </w:p>
         </w:tc>
@@ -2080,7 +2080,7 @@
               <w:rPr>
                 <w:sz w:val="18"/>
               </w:rPr>
-              <w:t>All the credentials these people keep waving around like they're something special? I'm ripping them up and tossing them in the trash — right along with everything else I used to take credit for. And why? Because of Christ. Yes, everything I once thought was so important is gone from my life. Compared to the epic privilege of knowing Christ Jesus as my Master, firsthand, everything I once had going for me is insignificant — total trash. I've dumped it all so I could grab onto Christ and be grabbed by Him. I don't want some weak, rule-based 'goodness.' I want the real, powerful kind that comes from trusting Christ — God's righteousness.</w:t>
+              <w:t>All the credentials these people keep waving around like they're something special? I'm ripping them up and tossing them in the trash — right along with everything else I used to take credit for. And why? Because of Christ. Yes, everything I once thought was so important is gone from my life. Compared to the epic privilege of knowing Christ Jesus as my Master, firsthand, everything I once had going for me is insignificant — dog dung. I've dumped it all so I could grab onto Christ and be grabbed by Him. I didn't want some weak, rule-based brand of righteousness. I wanted the real, powerful kind that comes from trusting Christ — God's righteousness.</w:t>
             </w:r>
           </w:p>
         </w:tc>
@@ -2103,7 +2103,7 @@
               <w:rPr>
                 <w:sz w:val="18"/>
               </w:rPr>
-              <w:t>걔네가 뭔가 대단한 것처럼 흔들어대는 그 스펙들? 나는 찢어서 쓰레기통에 버렸어. 내가 예전에 내세우던 다른 모든 것들도 마찬가지고. 왜? 그리스도 때문이야. 응. 내가 한때 그렇게 중요하게 생각했던 모든 게 내 인생에서 사라졌어. 예수 그리스도를 내 주인으로 직접 아는 이 엄청난 특권에 비하면, 내가 예전에 도움 된다고 생각했던 모든 건 그냥 하찮은 쓰레기야. 다 버렸다니까. 내가 그리스도를 붙잡고, 그분께 붙잡히고 싶었거든. 규칙 목록 지키면서 얻는 그 시시하고 하찮은 의로움 말고, 그리스도를 믿어서 얻는 그 탄탄한 의로움, 곧 하나님의 의로움을 갖고 싶었어.</w:t>
+              <w:t>걔네가 뭔가 대단한 것처럼 흔들어대는 그 스펙들? 나는 찢어서 쓰레기통에 버렸어. 내가 예전에 내세우던 다른 모든 것들도 마찬가지고. 왜? 그리스도 때문이야. 응. 내가 한때 그렇게 중요하게 생각했던 모든 게 내 인생에서 사라졌어. 예수 그리스도를 내 주인으로 직접 아는 이 엄청난 특권에 비하면, 내가 예전에 도움 된다고 생각했던 모든 건 그냥 개똥이야. 다 버렸다니까. 내가 그리스도를 붙잡고, 그분께 붙잡히고 싶었거든. 규칙 목록 지키면서 얻는 그 시시하고 하찮은 의로움 말고, 그리스도를 믿어서 얻는 그 탄탄한 의로움, 곧 하나님의 의로움을 갖고 싶었어.</w:t>
             </w:r>
           </w:p>
         </w:tc>

</xml_diff>